<commit_message>
Sincronización de códigos locales con repositorio remoto: actualización de reset_pass.py a resetear_password.py y nuevos archivos
</commit_message>
<xml_diff>
--- a/plantillas/modelo_contrato.docx
+++ b/plantillas/modelo_contrato.docx
@@ -63,55 +63,18 @@
       </w:r>
       <w:proofErr w:type="spellEnd"/>
       <w:r>
-        <w:t xml:space="preserve"> 9.197.559. quienes en lo adelante se denominarán EL BANCO</w:t>
-      </w:r>
-      <w:r>
-        <w:t xml:space="preserve"> DE LA COMUNA</w:t>
-      </w:r>
-      <w:r>
-        <w:t xml:space="preserve">; y por la otra parte el ciudadano(a) </w:t>
-      </w:r>
-      <w:r>
-        <w:rPr>
-          <w:u w:val="single"/>
-        </w:rPr>
-        <w:t>____________</w:t>
-      </w:r>
-      <w:r>
-        <w:rPr>
-          <w:u w:val="single"/>
-        </w:rPr>
+        <w:t xml:space="preserve"> 9.197.559. quienes en lo adelante se denominarán EL BANCO DE LA COMUNA; y por la otra parte el ciudadano(</w:t>
+      </w:r>
+      <w:proofErr w:type="gramStart"/>
+      <w:r>
+        <w:t>a)</w:t>
+      </w:r>
+      <w:r>
         <w:t xml:space="preserve">   </w:t>
       </w:r>
-      <w:r>
-        <w:rPr>
-          <w:u w:val="single"/>
-        </w:rPr>
-        <w:t xml:space="preserve">                                            </w:t>
-      </w:r>
-      <w:r>
-        <w:rPr>
-          <w:u w:val="single"/>
-        </w:rPr>
-        <w:t xml:space="preserve">     </w:t>
-      </w:r>
-      <w:r>
-        <w:rPr>
-          <w:u w:val="single"/>
-        </w:rPr>
-        <w:t xml:space="preserve">                                  </w:t>
-      </w:r>
-      <w:r>
-        <w:rPr>
-          <w:u w:val="single"/>
-        </w:rPr>
-        <w:t xml:space="preserve">  </w:t>
-      </w:r>
-      <w:r>
-        <w:rPr>
-          <w:u w:val="single"/>
-        </w:rPr>
-        <w:t>_</w:t>
+      <w:proofErr w:type="gramEnd"/>
+      <w:r>
+        <w:t xml:space="preserve">                                                           </w:t>
       </w:r>
       <w:r>
         <w:t xml:space="preserve">, titular de la C.I. </w:t>
@@ -122,36 +85,6 @@
       </w:r>
       <w:proofErr w:type="spellEnd"/>
       <w:r>
-        <w:t xml:space="preserve"> </w:t>
-      </w:r>
-      <w:r>
-        <w:rPr>
-          <w:u w:val="single"/>
-        </w:rPr>
-        <w:t>__</w:t>
-      </w:r>
-      <w:r>
-        <w:rPr>
-          <w:u w:val="single"/>
-        </w:rPr>
-        <w:t xml:space="preserve">             </w:t>
-      </w:r>
-      <w:r>
-        <w:rPr>
-          <w:u w:val="single"/>
-        </w:rPr>
-        <w:t xml:space="preserve">      </w:t>
-      </w:r>
-      <w:r>
-        <w:rPr>
-          <w:u w:val="single"/>
-        </w:rPr>
-        <w:t>______</w:t>
-      </w:r>
-      <w:r>
-        <w:rPr>
-          <w:u w:val="single"/>
-        </w:rPr>
         <w:t xml:space="preserve"> </w:t>
       </w:r>
       <w:r>
@@ -171,31 +104,7 @@
         <w:t>CLÁUSULA PRIMERA</w:t>
       </w:r>
       <w:r>
-        <w:t>: OBJETO. EL BANCO DE LA COMUNA</w:t>
-      </w:r>
-      <w:r>
-        <w:t xml:space="preserve">, </w:t>
-      </w:r>
-      <w:r>
-        <w:t xml:space="preserve">otorga un financiamiento hasta por la cantidad de CUATROCIENTOS DÓLARES DE LOS ESTADOS UNIDOS DE AMÉRICA (USD $400), entregados en </w:t>
-      </w:r>
-      <w:r>
-        <w:t>B</w:t>
-      </w:r>
-      <w:r>
-        <w:t>olívares</w:t>
-      </w:r>
-      <w:r>
-        <w:t>,</w:t>
-      </w:r>
-      <w:r>
-        <w:t xml:space="preserve"> según la tasa oficial vigente del Banco Central de Venezuela para la fecha de la firma</w:t>
-      </w:r>
-      <w:r>
-        <w:t xml:space="preserve"> del presente contrato</w:t>
-      </w:r>
-      <w:r>
-        <w:t xml:space="preserve">. </w:t>
+        <w:t xml:space="preserve">: OBJETO. EL BANCO DE LA COMUNA, otorga un financiamiento hasta por la cantidad de CUATROCIENTOS DÓLARES DE LOS ESTADOS UNIDOS DE AMÉRICA (USD $400), entregados en Bolívares, según la tasa oficial vigente del Banco Central de Venezuela para la fecha de la firma del presente contrato. </w:t>
       </w:r>
       <w:r>
         <w:rPr>
@@ -275,11 +184,11 @@
         <w:t>CLÁUSULA NOVENA</w:t>
       </w:r>
       <w:r>
-        <w:t xml:space="preserve">: </w:t>
+        <w:t xml:space="preserve">: RECONOCIMIENTO EXPRESO DE DEUDA. El beneficiario reconoce expresa e irrevocablemente la </w:t>
       </w:r>
       <w:r>
         <w:lastRenderedPageBreak/>
-        <w:t xml:space="preserve">RECONOCIMIENTO EXPRESO DE DEUDA. El beneficiario reconoce expresa e irrevocablemente la deuda asumida, constituyendo el presente documento prueba suficiente de obligación líquida, exigible y de plazo vencido, con mérito ejecutivo conforme a la legislación venezolana. </w:t>
+        <w:t xml:space="preserve">deuda asumida, constituyendo el presente documento prueba suficiente de obligación líquida, exigible y de plazo vencido, con mérito ejecutivo conforme a la legislación venezolana. </w:t>
       </w:r>
       <w:r>
         <w:rPr>
@@ -289,13 +198,7 @@
         <w:t>CLÁUSULA DÉCIMA</w:t>
       </w:r>
       <w:r>
-        <w:t>: VIGENCIA</w:t>
-      </w:r>
-      <w:r>
-        <w:t xml:space="preserve"> </w:t>
-      </w:r>
-      <w:r>
-        <w:t xml:space="preserve">El contrato tendrá una duración de once (11) meses contados desde el desembolso. </w:t>
+        <w:t xml:space="preserve">: VIGENCIA El contrato tendrá una duración de once (11) meses contados desde el desembolso. </w:t>
       </w:r>
       <w:r>
         <w:rPr>
@@ -388,13 +291,7 @@
         <w:jc w:val="both"/>
       </w:pPr>
       <w:r>
-        <w:t xml:space="preserve">C.I. </w:t>
-      </w:r>
-      <w:r>
-        <w:t>V-</w:t>
-      </w:r>
-      <w:r>
-        <w:t xml:space="preserve"> 13.283.348</w:t>
+        <w:t>C.I. V- 13.283.348</w:t>
       </w:r>
       <w:r>
         <w:tab/>
@@ -410,16 +307,7 @@
       </w:r>
       <w:r>
         <w:tab/>
-        <w:t xml:space="preserve">   </w:t>
-      </w:r>
-      <w:r>
-        <w:t xml:space="preserve">C.I. </w:t>
-      </w:r>
-      <w:r>
-        <w:t>V-</w:t>
-      </w:r>
-      <w:r>
-        <w:t>17.793.082</w:t>
+        <w:t xml:space="preserve">   C.I. V-17.793.082</w:t>
       </w:r>
       <w:r>
         <w:tab/>
@@ -443,13 +331,7 @@
         <w:jc w:val="center"/>
       </w:pPr>
       <w:r>
-        <w:t xml:space="preserve">C.I. </w:t>
-      </w:r>
-      <w:r>
-        <w:t>V-</w:t>
-      </w:r>
-      <w:r>
-        <w:t>9.197.559</w:t>
+        <w:t>C.I. V-9.197.559</w:t>
       </w:r>
     </w:p>
     <w:p>

</xml_diff>

<commit_message>
Actualizaciones generales: Correcciones, geocodificación, y mejoras UI
</commit_message>
<xml_diff>
--- a/plantillas/modelo_contrato.docx
+++ b/plantillas/modelo_contrato.docx
@@ -39,53 +39,13 @@
         <w:t>BANCO DE LA COMUNA PRODUCTIVA PRESIDENTE OBRERO</w:t>
       </w:r>
       <w:r>
-        <w:t xml:space="preserve">, debidamente constituido conforme a la legislación de la República Bolivariana de Venezuela, actuando en este acto mediante sus voceras autorizadas: YASMELY DEL VALLE FINOL HERNÁNDEZ, C.I. </w:t>
-      </w:r>
-      <w:proofErr w:type="spellStart"/>
-      <w:r>
-        <w:t>Nº</w:t>
-      </w:r>
-      <w:proofErr w:type="spellEnd"/>
-      <w:r>
-        <w:t xml:space="preserve"> 13.283.348. YASMIN DEL CARMEN HERNÁNDEZ LEÓN, C.I. </w:t>
-      </w:r>
-      <w:proofErr w:type="spellStart"/>
-      <w:r>
-        <w:t>Nº</w:t>
-      </w:r>
-      <w:proofErr w:type="spellEnd"/>
-      <w:r>
-        <w:t xml:space="preserve"> 17.793.082. LUZMIDA PÉREZ, C.I. </w:t>
-      </w:r>
-      <w:proofErr w:type="spellStart"/>
-      <w:r>
-        <w:t>Nº</w:t>
-      </w:r>
-      <w:proofErr w:type="spellEnd"/>
-      <w:r>
-        <w:t xml:space="preserve"> 9.197.559. quienes en lo adelante se denominarán EL BANCO DE LA COMUNA; y por la otra parte el ciudadano(</w:t>
-      </w:r>
-      <w:proofErr w:type="gramStart"/>
-      <w:r>
-        <w:t>a)</w:t>
-      </w:r>
-      <w:r>
-        <w:t xml:space="preserve">   </w:t>
-      </w:r>
-      <w:proofErr w:type="gramEnd"/>
-      <w:r>
-        <w:t xml:space="preserve">                                                           </w:t>
-      </w:r>
-      <w:r>
-        <w:t xml:space="preserve">, titular de la C.I. </w:t>
-      </w:r>
-      <w:proofErr w:type="spellStart"/>
-      <w:r>
-        <w:t>Nº</w:t>
-      </w:r>
-      <w:proofErr w:type="spellEnd"/>
-      <w:r>
-        <w:t xml:space="preserve"> </w:t>
+        <w:t>, debidamente constituido conforme a la legislación de la República Bolivariana de Venezuela, actuando en este acto mediante sus voceras autorizadas: YASMELY DEL VALLE FINOL HERNÁNDEZ, C.I. Nº 13.283.348. YASMIN DEL CARMEN HERNÁNDEZ LEÓN, C.I. Nº 17.793.082. LUZMIDA PÉREZ, C.I. Nº 9.197.559. quienes en lo adelante se denominarán EL BANCO DE LA COMUNA; y por la otra parte el ciudadano(a)</w:t>
+      </w:r>
+      <w:r>
+        <w:t xml:space="preserve">                                                              </w:t>
+      </w:r>
+      <w:r>
+        <w:t xml:space="preserve">, titular de la C.I. Nº </w:t>
       </w:r>
       <w:r>
         <w:t xml:space="preserve">Rif:        </w:t>

</xml_diff>